<commit_message>
EK-1: fix LanguaL reference (wrong DOI → correct Ireland & Møller 2010)
The Møller (2008) "LanguaL 2006 – the LanguaL thesaurus" entry carried DOI
10.1038/ejcn.2008.50, which actually resolves to an unrelated EJCN paper
("Hemoglobin concentration ... Colombian school-age children", vol 63,
842–849). Replaced with the verified LanguaL reference:
Ireland, J.D., & Møller, A. (2010). LanguaL food description: a learning
process. EJCN, 64(S3), S44–S48. https://doi.org/10.1038/ejcn.2010.209
Updated the in-text citation (§4.5.1 standards table) to match and re-filed
the entry alphabetically under "I". Regenerated main-form + EK-1 DOCX.

Co-Authored-By: Claude Opus 4.8 <noreply@anthropic.com>
</commit_message>
<xml_diff>
--- a/docs/OpenNutri_1005_EK1_Kaynaklar.docx
+++ b/docs/OpenNutri_1005_EK1_Kaynaklar.docx
@@ -678,6 +678,41 @@
           <w:rFonts w:ascii="Arial" w:hAnsi="Arial" w:eastAsia="Arial"/>
           <w:sz w:val="18"/>
         </w:rPr>
+        <w:t xml:space="preserve">Ireland, J.D., &amp; Møller, A. (2010). LanguaL food description: a learning process. </w:t>
+      </w:r>
+      <w:r>
+        <w:rPr>
+          <w:rFonts w:ascii="Arial" w:hAnsi="Arial" w:eastAsia="Arial"/>
+          <w:i/>
+          <w:sz w:val="18"/>
+        </w:rPr>
+        <w:t>European Journal of Clinical Nutrition</w:t>
+      </w:r>
+      <w:r>
+        <w:rPr>
+          <w:rFonts w:ascii="Arial" w:hAnsi="Arial" w:eastAsia="Arial"/>
+          <w:sz w:val="18"/>
+        </w:rPr>
+        <w:t>, 64(S3), S44–S48. https://doi.org/10.1038/ejcn.2010.209</w:t>
+      </w:r>
+    </w:p>
+    <w:p>
+      <w:pPr>
+        <w:spacing w:after="60" w:before="0" w:line="240" w:lineRule="auto"/>
+        <w:ind w:left="198" w:hanging="113"/>
+      </w:pPr>
+      <w:r>
+        <w:rPr>
+          <w:rFonts w:ascii="Arial" w:hAnsi="Arial" w:eastAsia="Arial"/>
+          <w:sz w:val="18"/>
+        </w:rPr>
+        <w:t xml:space="preserve">• </w:t>
+      </w:r>
+      <w:r>
+        <w:rPr>
+          <w:rFonts w:ascii="Arial" w:hAnsi="Arial" w:eastAsia="Arial"/>
+          <w:sz w:val="18"/>
+        </w:rPr>
         <w:t xml:space="preserve">Ispirova, G., Eftimov, T., &amp; Koroušić Seljak, B. (2020). P-NUT: Predicting NUTrient content from short text descriptions. </w:t>
       </w:r>
       <w:r>
@@ -1009,41 +1044,6 @@
           <w:sz w:val="18"/>
         </w:rPr>
         <w:t>. Manning Publications.</w:t>
-      </w:r>
-    </w:p>
-    <w:p>
-      <w:pPr>
-        <w:spacing w:after="60" w:before="0" w:line="240" w:lineRule="auto"/>
-        <w:ind w:left="198" w:hanging="113"/>
-      </w:pPr>
-      <w:r>
-        <w:rPr>
-          <w:rFonts w:ascii="Arial" w:hAnsi="Arial" w:eastAsia="Arial"/>
-          <w:sz w:val="18"/>
-        </w:rPr>
-        <w:t xml:space="preserve">• </w:t>
-      </w:r>
-      <w:r>
-        <w:rPr>
-          <w:rFonts w:ascii="Arial" w:hAnsi="Arial" w:eastAsia="Arial"/>
-          <w:sz w:val="18"/>
-        </w:rPr>
-        <w:t xml:space="preserve">Møller, A., et al. (2008). LanguaL 2006 – the LanguaL thesaurus. </w:t>
-      </w:r>
-      <w:r>
-        <w:rPr>
-          <w:rFonts w:ascii="Arial" w:hAnsi="Arial" w:eastAsia="Arial"/>
-          <w:i/>
-          <w:sz w:val="18"/>
-        </w:rPr>
-        <w:t>European Journal of Clinical Nutrition</w:t>
-      </w:r>
-      <w:r>
-        <w:rPr>
-          <w:rFonts w:ascii="Arial" w:hAnsi="Arial" w:eastAsia="Arial"/>
-          <w:sz w:val="18"/>
-        </w:rPr>
-        <w:t>, 62, S272–S275. https://doi.org/10.1038/ejcn.2008.50</w:t>
       </w:r>
     </w:p>
     <w:p>

</xml_diff>